<commit_message>
removed p 1.5 GRAIN / DIM / FACT
</commit_message>
<xml_diff>
--- a/Introduction_to_DWH_and_ETL_Business_Template.docx
+++ b/Introduction_to_DWH_and_ETL_Business_Template.docx
@@ -2058,1370 +2058,6 @@
       <w:pPr>
         <w:pStyle w:val="BodyText"/>
       </w:pPr>
-      <w:r>
-        <w:t>The grain of the fact table is defined as:</w:t>
-      </w:r>
-    </w:p>
-    <w:p>
-      <w:pPr>
-        <w:pStyle w:val="BodyText"/>
-      </w:pPr>
-      <w:r>
-        <w:t>One row in the fact table represents one airline ticket booking transaction made by one customer through one booking channel at a specific point in time.</w:t>
-      </w:r>
-    </w:p>
-    <w:p>
-      <w:pPr>
-        <w:pStyle w:val="BodyText"/>
-      </w:pPr>
-      <w:r>
-        <w:t>Dimension Tables</w:t>
-      </w:r>
-    </w:p>
-    <w:p>
-      <w:pPr>
-        <w:pStyle w:val="BodyText"/>
-      </w:pPr>
-      <w:proofErr w:type="spellStart"/>
-      <w:r>
-        <w:t>DimCustomer</w:t>
-      </w:r>
-      <w:proofErr w:type="spellEnd"/>
-    </w:p>
-    <w:p>
-      <w:pPr>
-        <w:pStyle w:val="BodyText"/>
-      </w:pPr>
-      <w:r>
-        <w:t>Purpose:</w:t>
-      </w:r>
-    </w:p>
-    <w:p>
-      <w:pPr>
-        <w:pStyle w:val="BodyText"/>
-      </w:pPr>
-      <w:r>
-        <w:t>Stores descriptive information about customers.</w:t>
-      </w:r>
-    </w:p>
-    <w:p>
-      <w:pPr>
-        <w:pStyle w:val="BodyText"/>
-      </w:pPr>
-      <w:r>
-        <w:t>Primary Key:</w:t>
-      </w:r>
-    </w:p>
-    <w:p>
-      <w:pPr>
-        <w:pStyle w:val="BodyText"/>
-      </w:pPr>
-      <w:proofErr w:type="spellStart"/>
-      <w:r>
-        <w:t>CustomerKey</w:t>
-      </w:r>
-      <w:proofErr w:type="spellEnd"/>
-    </w:p>
-    <w:p>
-      <w:pPr>
-        <w:pStyle w:val="BodyText"/>
-      </w:pPr>
-      <w:r>
-        <w:t>Business Key:</w:t>
-      </w:r>
-    </w:p>
-    <w:p>
-      <w:pPr>
-        <w:pStyle w:val="BodyText"/>
-      </w:pPr>
-      <w:proofErr w:type="spellStart"/>
-      <w:r>
-        <w:t>CustomerID</w:t>
-      </w:r>
-      <w:proofErr w:type="spellEnd"/>
-    </w:p>
-    <w:p>
-      <w:pPr>
-        <w:pStyle w:val="BodyText"/>
-      </w:pPr>
-      <w:r>
-        <w:t>Attributes:</w:t>
-      </w:r>
-    </w:p>
-    <w:p>
-      <w:pPr>
-        <w:pStyle w:val="BodyText"/>
-      </w:pPr>
-      <w:r>
-        <w:t xml:space="preserve">* </w:t>
-      </w:r>
-      <w:proofErr w:type="spellStart"/>
-      <w:r>
-        <w:t>CustomerID</w:t>
-      </w:r>
-      <w:proofErr w:type="spellEnd"/>
-    </w:p>
-    <w:p>
-      <w:pPr>
-        <w:pStyle w:val="BodyText"/>
-      </w:pPr>
-      <w:r>
-        <w:t>* Gender</w:t>
-      </w:r>
-    </w:p>
-    <w:p>
-      <w:pPr>
-        <w:pStyle w:val="BodyText"/>
-      </w:pPr>
-      <w:r>
-        <w:t>* Age</w:t>
-      </w:r>
-    </w:p>
-    <w:p>
-      <w:pPr>
-        <w:pStyle w:val="BodyText"/>
-      </w:pPr>
-      <w:r>
-        <w:t xml:space="preserve">* </w:t>
-      </w:r>
-      <w:proofErr w:type="spellStart"/>
-      <w:r>
-        <w:t>CustomerType</w:t>
-      </w:r>
-      <w:proofErr w:type="spellEnd"/>
-    </w:p>
-    <w:p>
-      <w:pPr>
-        <w:pStyle w:val="BodyText"/>
-      </w:pPr>
-      <w:r>
-        <w:t xml:space="preserve">* </w:t>
-      </w:r>
-      <w:proofErr w:type="spellStart"/>
-      <w:r>
-        <w:t>AgeGroup</w:t>
-      </w:r>
-      <w:proofErr w:type="spellEnd"/>
-    </w:p>
-    <w:p>
-      <w:pPr>
-        <w:pStyle w:val="BodyText"/>
-      </w:pPr>
-    </w:p>
-    <w:p>
-      <w:pPr>
-        <w:pStyle w:val="BodyText"/>
-      </w:pPr>
-      <w:proofErr w:type="spellStart"/>
-      <w:r>
-        <w:t>DimDate</w:t>
-      </w:r>
-      <w:proofErr w:type="spellEnd"/>
-    </w:p>
-    <w:p>
-      <w:pPr>
-        <w:pStyle w:val="BodyText"/>
-      </w:pPr>
-      <w:proofErr w:type="spellStart"/>
-      <w:proofErr w:type="gramStart"/>
-      <w:r>
-        <w:t>Purpose:Provides</w:t>
-      </w:r>
-      <w:proofErr w:type="spellEnd"/>
-      <w:proofErr w:type="gramEnd"/>
-      <w:r>
-        <w:t xml:space="preserve"> temporal analysis capabilities.</w:t>
-      </w:r>
-    </w:p>
-    <w:p>
-      <w:pPr>
-        <w:pStyle w:val="BodyText"/>
-      </w:pPr>
-      <w:r>
-        <w:t>Primary Key:</w:t>
-      </w:r>
-    </w:p>
-    <w:p>
-      <w:pPr>
-        <w:pStyle w:val="BodyText"/>
-      </w:pPr>
-      <w:proofErr w:type="spellStart"/>
-      <w:r>
-        <w:t>DateKey</w:t>
-      </w:r>
-      <w:proofErr w:type="spellEnd"/>
-    </w:p>
-    <w:p>
-      <w:pPr>
-        <w:pStyle w:val="BodyText"/>
-      </w:pPr>
-      <w:r>
-        <w:t>Attributes:</w:t>
-      </w:r>
-    </w:p>
-    <w:p>
-      <w:pPr>
-        <w:pStyle w:val="BodyText"/>
-      </w:pPr>
-      <w:r>
-        <w:t xml:space="preserve">* </w:t>
-      </w:r>
-      <w:proofErr w:type="spellStart"/>
-      <w:r>
-        <w:t>FullDate</w:t>
-      </w:r>
-      <w:proofErr w:type="spellEnd"/>
-    </w:p>
-    <w:p>
-      <w:pPr>
-        <w:pStyle w:val="BodyText"/>
-      </w:pPr>
-      <w:r>
-        <w:t>* Day</w:t>
-      </w:r>
-    </w:p>
-    <w:p>
-      <w:pPr>
-        <w:pStyle w:val="BodyText"/>
-      </w:pPr>
-      <w:r>
-        <w:t>* Month</w:t>
-      </w:r>
-    </w:p>
-    <w:p>
-      <w:pPr>
-        <w:pStyle w:val="BodyText"/>
-      </w:pPr>
-      <w:r>
-        <w:lastRenderedPageBreak/>
-        <w:t xml:space="preserve">* </w:t>
-      </w:r>
-      <w:proofErr w:type="spellStart"/>
-      <w:r>
-        <w:t>MonthName</w:t>
-      </w:r>
-      <w:proofErr w:type="spellEnd"/>
-    </w:p>
-    <w:p>
-      <w:pPr>
-        <w:pStyle w:val="BodyText"/>
-      </w:pPr>
-      <w:r>
-        <w:t>* Quarter</w:t>
-      </w:r>
-    </w:p>
-    <w:p>
-      <w:pPr>
-        <w:pStyle w:val="BodyText"/>
-      </w:pPr>
-      <w:r>
-        <w:t>* Year</w:t>
-      </w:r>
-    </w:p>
-    <w:p>
-      <w:pPr>
-        <w:pStyle w:val="BodyText"/>
-      </w:pPr>
-      <w:r>
-        <w:t>* Week</w:t>
-      </w:r>
-    </w:p>
-    <w:p>
-      <w:pPr>
-        <w:pStyle w:val="BodyText"/>
-      </w:pPr>
-      <w:r>
-        <w:t xml:space="preserve">* </w:t>
-      </w:r>
-      <w:proofErr w:type="spellStart"/>
-      <w:r>
-        <w:t>DayOfWeek</w:t>
-      </w:r>
-      <w:proofErr w:type="spellEnd"/>
-    </w:p>
-    <w:p>
-      <w:pPr>
-        <w:pStyle w:val="BodyText"/>
-      </w:pPr>
-      <w:r>
-        <w:t>Hierarchy:</w:t>
-      </w:r>
-    </w:p>
-    <w:p>
-      <w:pPr>
-        <w:pStyle w:val="BodyText"/>
-      </w:pPr>
-      <w:r>
-        <w:t xml:space="preserve">Year </w:t>
-      </w:r>
-      <w:r>
-        <w:rPr>
-          <w:rFonts w:ascii="Arial" w:hAnsi="Arial" w:cs="Arial"/>
-        </w:rPr>
-        <w:t>→</w:t>
-      </w:r>
-      <w:r>
-        <w:t xml:space="preserve"> Quarter </w:t>
-      </w:r>
-      <w:r>
-        <w:rPr>
-          <w:rFonts w:ascii="Arial" w:hAnsi="Arial" w:cs="Arial"/>
-        </w:rPr>
-        <w:t>→</w:t>
-      </w:r>
-      <w:r>
-        <w:t xml:space="preserve"> Month </w:t>
-      </w:r>
-      <w:r>
-        <w:rPr>
-          <w:rFonts w:ascii="Arial" w:hAnsi="Arial" w:cs="Arial"/>
-        </w:rPr>
-        <w:t>→</w:t>
-      </w:r>
-      <w:r>
-        <w:t xml:space="preserve"> Day</w:t>
-      </w:r>
-    </w:p>
-    <w:p>
-      <w:pPr>
-        <w:pStyle w:val="BodyText"/>
-      </w:pPr>
-      <w:r>
-        <w:t xml:space="preserve"> </w:t>
-      </w:r>
-      <w:proofErr w:type="spellStart"/>
-      <w:r>
-        <w:t>DimTravel</w:t>
-      </w:r>
-      <w:proofErr w:type="spellEnd"/>
-    </w:p>
-    <w:p>
-      <w:pPr>
-        <w:pStyle w:val="BodyText"/>
-      </w:pPr>
-      <w:r>
-        <w:t>Purpose:</w:t>
-      </w:r>
-    </w:p>
-    <w:p>
-      <w:pPr>
-        <w:pStyle w:val="BodyText"/>
-      </w:pPr>
-      <w:r>
-        <w:t>Stores travel-related information.</w:t>
-      </w:r>
-    </w:p>
-    <w:p>
-      <w:pPr>
-        <w:pStyle w:val="BodyText"/>
-      </w:pPr>
-      <w:r>
-        <w:t>Primary Key:</w:t>
-      </w:r>
-    </w:p>
-    <w:p>
-      <w:pPr>
-        <w:pStyle w:val="BodyText"/>
-      </w:pPr>
-      <w:proofErr w:type="spellStart"/>
-      <w:r>
-        <w:t>TravelKey</w:t>
-      </w:r>
-      <w:proofErr w:type="spellEnd"/>
-    </w:p>
-    <w:p>
-      <w:pPr>
-        <w:pStyle w:val="BodyText"/>
-      </w:pPr>
-      <w:r>
-        <w:t>Attributes:</w:t>
-      </w:r>
-    </w:p>
-    <w:p>
-      <w:pPr>
-        <w:pStyle w:val="BodyText"/>
-      </w:pPr>
-      <w:r>
-        <w:t xml:space="preserve">* </w:t>
-      </w:r>
-      <w:proofErr w:type="spellStart"/>
-      <w:r>
-        <w:t>TravelType</w:t>
-      </w:r>
-      <w:proofErr w:type="spellEnd"/>
-    </w:p>
-    <w:p>
-      <w:pPr>
-        <w:pStyle w:val="BodyText"/>
-      </w:pPr>
-      <w:r>
-        <w:t xml:space="preserve">* </w:t>
-      </w:r>
-      <w:proofErr w:type="spellStart"/>
-      <w:r>
-        <w:t>TravelClass</w:t>
-      </w:r>
-      <w:proofErr w:type="spellEnd"/>
-    </w:p>
-    <w:p>
-      <w:pPr>
-        <w:pStyle w:val="BodyText"/>
-      </w:pPr>
-      <w:r>
-        <w:t xml:space="preserve">* </w:t>
-      </w:r>
-      <w:proofErr w:type="spellStart"/>
-      <w:r>
-        <w:t>FlightDistance</w:t>
-      </w:r>
-      <w:proofErr w:type="spellEnd"/>
-    </w:p>
-    <w:p>
-      <w:pPr>
-        <w:pStyle w:val="BodyText"/>
-      </w:pPr>
-      <w:r>
-        <w:t xml:space="preserve">* </w:t>
-      </w:r>
-      <w:proofErr w:type="spellStart"/>
-      <w:r>
-        <w:t>DistanceCategory</w:t>
-      </w:r>
-      <w:proofErr w:type="spellEnd"/>
-    </w:p>
-    <w:p>
-      <w:pPr>
-        <w:pStyle w:val="BodyText"/>
-      </w:pPr>
-      <w:r>
-        <w:t>Hierarchy:</w:t>
-      </w:r>
-    </w:p>
-    <w:p>
-      <w:pPr>
-        <w:pStyle w:val="BodyText"/>
-      </w:pPr>
-      <w:proofErr w:type="spellStart"/>
-      <w:r>
-        <w:t>DistanceCategory</w:t>
-      </w:r>
-      <w:proofErr w:type="spellEnd"/>
-      <w:r>
-        <w:t xml:space="preserve"> </w:t>
-      </w:r>
-      <w:r>
-        <w:rPr>
-          <w:rFonts w:ascii="Arial" w:hAnsi="Arial" w:cs="Arial"/>
-        </w:rPr>
-        <w:t>→</w:t>
-      </w:r>
-      <w:r>
-        <w:t xml:space="preserve"> </w:t>
-      </w:r>
-      <w:proofErr w:type="spellStart"/>
-      <w:r>
-        <w:t>TravelClass</w:t>
-      </w:r>
-      <w:proofErr w:type="spellEnd"/>
-      <w:r>
-        <w:t xml:space="preserve"> </w:t>
-      </w:r>
-      <w:r>
-        <w:rPr>
-          <w:rFonts w:ascii="Arial" w:hAnsi="Arial" w:cs="Arial"/>
-        </w:rPr>
-        <w:t>→</w:t>
-      </w:r>
-      <w:r>
-        <w:t xml:space="preserve"> </w:t>
-      </w:r>
-      <w:proofErr w:type="spellStart"/>
-      <w:r>
-        <w:t>TravelType</w:t>
-      </w:r>
-      <w:proofErr w:type="spellEnd"/>
-    </w:p>
-    <w:p>
-      <w:pPr>
-        <w:pStyle w:val="BodyText"/>
-      </w:pPr>
-      <w:proofErr w:type="spellStart"/>
-      <w:r>
-        <w:t>DimBooking</w:t>
-      </w:r>
-      <w:proofErr w:type="spellEnd"/>
-    </w:p>
-    <w:p>
-      <w:pPr>
-        <w:pStyle w:val="BodyText"/>
-      </w:pPr>
-      <w:r>
-        <w:t>Purpose:</w:t>
-      </w:r>
-    </w:p>
-    <w:p>
-      <w:pPr>
-        <w:pStyle w:val="BodyText"/>
-      </w:pPr>
-      <w:r>
-        <w:t>Describes booking transaction characteristics.</w:t>
-      </w:r>
-    </w:p>
-    <w:p>
-      <w:pPr>
-        <w:pStyle w:val="BodyText"/>
-      </w:pPr>
-      <w:r>
-        <w:t>Primary Key:</w:t>
-      </w:r>
-    </w:p>
-    <w:p>
-      <w:pPr>
-        <w:pStyle w:val="BodyText"/>
-      </w:pPr>
-      <w:proofErr w:type="spellStart"/>
-      <w:r>
-        <w:t>BookingKey</w:t>
-      </w:r>
-      <w:proofErr w:type="spellEnd"/>
-    </w:p>
-    <w:p>
-      <w:pPr>
-        <w:pStyle w:val="BodyText"/>
-      </w:pPr>
-      <w:r>
-        <w:t>Business Key:</w:t>
-      </w:r>
-    </w:p>
-    <w:p>
-      <w:pPr>
-        <w:pStyle w:val="BodyText"/>
-      </w:pPr>
-      <w:proofErr w:type="spellStart"/>
-      <w:r>
-        <w:t>BookingID</w:t>
-      </w:r>
-      <w:proofErr w:type="spellEnd"/>
-    </w:p>
-    <w:p>
-      <w:pPr>
-        <w:pStyle w:val="BodyText"/>
-      </w:pPr>
-      <w:r>
-        <w:t>Attributes:</w:t>
-      </w:r>
-    </w:p>
-    <w:p>
-      <w:pPr>
-        <w:pStyle w:val="BodyText"/>
-      </w:pPr>
-      <w:r>
-        <w:t xml:space="preserve">* </w:t>
-      </w:r>
-      <w:proofErr w:type="spellStart"/>
-      <w:r>
-        <w:t>BookingChannel</w:t>
-      </w:r>
-      <w:proofErr w:type="spellEnd"/>
-    </w:p>
-    <w:p>
-      <w:pPr>
-        <w:pStyle w:val="BodyText"/>
-      </w:pPr>
-      <w:r>
-        <w:t xml:space="preserve">* </w:t>
-      </w:r>
-      <w:proofErr w:type="spellStart"/>
-      <w:r>
-        <w:t>PaymentMethod</w:t>
-      </w:r>
-      <w:proofErr w:type="spellEnd"/>
-    </w:p>
-    <w:p>
-      <w:pPr>
-        <w:pStyle w:val="BodyText"/>
-      </w:pPr>
-      <w:r>
-        <w:t xml:space="preserve">* </w:t>
-      </w:r>
-      <w:proofErr w:type="spellStart"/>
-      <w:r>
-        <w:t>TravelInsurance</w:t>
-      </w:r>
-      <w:proofErr w:type="spellEnd"/>
-    </w:p>
-    <w:p>
-      <w:pPr>
-        <w:pStyle w:val="BodyText"/>
-      </w:pPr>
-      <w:r>
-        <w:t>Example values:</w:t>
-      </w:r>
-    </w:p>
-    <w:p>
-      <w:pPr>
-        <w:pStyle w:val="BodyText"/>
-      </w:pPr>
-      <w:proofErr w:type="spellStart"/>
-      <w:r>
-        <w:t>BookingChannel</w:t>
-      </w:r>
-      <w:proofErr w:type="spellEnd"/>
-      <w:r>
-        <w:t>:</w:t>
-      </w:r>
-    </w:p>
-    <w:p>
-      <w:pPr>
-        <w:pStyle w:val="BodyText"/>
-      </w:pPr>
-      <w:r>
-        <w:t>* Website</w:t>
-      </w:r>
-    </w:p>
-    <w:p>
-      <w:pPr>
-        <w:pStyle w:val="BodyText"/>
-      </w:pPr>
-      <w:r>
-        <w:t>* Mobile App</w:t>
-      </w:r>
-    </w:p>
-    <w:p>
-      <w:pPr>
-        <w:pStyle w:val="BodyText"/>
-      </w:pPr>
-      <w:r>
-        <w:t>* Travel Agency</w:t>
-      </w:r>
-    </w:p>
-    <w:p>
-      <w:pPr>
-        <w:pStyle w:val="BodyText"/>
-      </w:pPr>
-      <w:proofErr w:type="spellStart"/>
-      <w:r>
-        <w:t>PaymentMethod</w:t>
-      </w:r>
-      <w:proofErr w:type="spellEnd"/>
-      <w:r>
-        <w:t>:</w:t>
-      </w:r>
-    </w:p>
-    <w:p>
-      <w:pPr>
-        <w:pStyle w:val="BodyText"/>
-      </w:pPr>
-      <w:r>
-        <w:t>* Credit Card</w:t>
-      </w:r>
-    </w:p>
-    <w:p>
-      <w:pPr>
-        <w:pStyle w:val="BodyText"/>
-      </w:pPr>
-      <w:r>
-        <w:t>* Debit Card</w:t>
-      </w:r>
-    </w:p>
-    <w:p>
-      <w:pPr>
-        <w:pStyle w:val="BodyText"/>
-      </w:pPr>
-      <w:r>
-        <w:t>* PayPal</w:t>
-      </w:r>
-    </w:p>
-    <w:p>
-      <w:pPr>
-        <w:pStyle w:val="BodyText"/>
-      </w:pPr>
-      <w:r>
-        <w:t xml:space="preserve"> </w:t>
-      </w:r>
-      <w:proofErr w:type="spellStart"/>
-      <w:r>
-        <w:t>DimLoyalty</w:t>
-      </w:r>
-      <w:proofErr w:type="spellEnd"/>
-    </w:p>
-    <w:p>
-      <w:pPr>
-        <w:pStyle w:val="BodyText"/>
-      </w:pPr>
-    </w:p>
-    <w:p>
-      <w:pPr>
-        <w:pStyle w:val="BodyText"/>
-      </w:pPr>
-      <w:r>
-        <w:t>Purpose:</w:t>
-      </w:r>
-    </w:p>
-    <w:p>
-      <w:pPr>
-        <w:pStyle w:val="BodyText"/>
-      </w:pPr>
-      <w:r>
-        <w:t>Stores customer loyalty program information.</w:t>
-      </w:r>
-    </w:p>
-    <w:p>
-      <w:pPr>
-        <w:pStyle w:val="BodyText"/>
-      </w:pPr>
-      <w:r>
-        <w:t>Primary Key:</w:t>
-      </w:r>
-    </w:p>
-    <w:p>
-      <w:pPr>
-        <w:pStyle w:val="BodyText"/>
-      </w:pPr>
-      <w:proofErr w:type="spellStart"/>
-      <w:r>
-        <w:t>LoyaltyKey</w:t>
-      </w:r>
-      <w:proofErr w:type="spellEnd"/>
-    </w:p>
-    <w:p>
-      <w:pPr>
-        <w:pStyle w:val="BodyText"/>
-      </w:pPr>
-      <w:r>
-        <w:t>Attributes:</w:t>
-      </w:r>
-    </w:p>
-    <w:p>
-      <w:pPr>
-        <w:pStyle w:val="BodyText"/>
-      </w:pPr>
-      <w:r>
-        <w:t xml:space="preserve">* </w:t>
-      </w:r>
-      <w:proofErr w:type="spellStart"/>
-      <w:r>
-        <w:t>LoyaltyLevel</w:t>
-      </w:r>
-      <w:proofErr w:type="spellEnd"/>
-    </w:p>
-    <w:p>
-      <w:pPr>
-        <w:pStyle w:val="BodyText"/>
-      </w:pPr>
-      <w:r>
-        <w:t xml:space="preserve">* </w:t>
-      </w:r>
-      <w:proofErr w:type="spellStart"/>
-      <w:r>
-        <w:t>LoyaltyRank</w:t>
-      </w:r>
-      <w:proofErr w:type="spellEnd"/>
-    </w:p>
-    <w:p>
-      <w:pPr>
-        <w:pStyle w:val="BodyText"/>
-      </w:pPr>
-      <w:r>
-        <w:t xml:space="preserve">* </w:t>
-      </w:r>
-      <w:proofErr w:type="spellStart"/>
-      <w:r>
-        <w:t>PriorityServiceFlag</w:t>
-      </w:r>
-      <w:proofErr w:type="spellEnd"/>
-    </w:p>
-    <w:p>
-      <w:pPr>
-        <w:pStyle w:val="BodyText"/>
-      </w:pPr>
-      <w:r>
-        <w:t>Values:</w:t>
-      </w:r>
-    </w:p>
-    <w:p>
-      <w:pPr>
-        <w:pStyle w:val="BodyText"/>
-      </w:pPr>
-      <w:r>
-        <w:t>* Silver</w:t>
-      </w:r>
-    </w:p>
-    <w:p>
-      <w:pPr>
-        <w:pStyle w:val="BodyText"/>
-      </w:pPr>
-      <w:r>
-        <w:t>* Gold</w:t>
-      </w:r>
-    </w:p>
-    <w:p>
-      <w:pPr>
-        <w:pStyle w:val="BodyText"/>
-      </w:pPr>
-      <w:r>
-        <w:t>* Platinum</w:t>
-      </w:r>
-    </w:p>
-    <w:p>
-      <w:pPr>
-        <w:pStyle w:val="BodyText"/>
-      </w:pPr>
-      <w:r>
-        <w:t>Hierarchy:</w:t>
-      </w:r>
-    </w:p>
-    <w:p>
-      <w:pPr>
-        <w:pStyle w:val="BodyText"/>
-      </w:pPr>
-      <w:proofErr w:type="spellStart"/>
-      <w:r>
-        <w:t>LoyaltyLevel</w:t>
-      </w:r>
-      <w:proofErr w:type="spellEnd"/>
-    </w:p>
-    <w:p>
-      <w:pPr>
-        <w:pStyle w:val="BodyText"/>
-      </w:pPr>
-      <w:proofErr w:type="spellStart"/>
-      <w:r>
-        <w:t>DimSatisfaction</w:t>
-      </w:r>
-      <w:proofErr w:type="spellEnd"/>
-    </w:p>
-    <w:p>
-      <w:pPr>
-        <w:pStyle w:val="BodyText"/>
-      </w:pPr>
-      <w:r>
-        <w:t>Purpose:</w:t>
-      </w:r>
-    </w:p>
-    <w:p>
-      <w:pPr>
-        <w:pStyle w:val="BodyText"/>
-      </w:pPr>
-      <w:r>
-        <w:t>Stores customer satisfaction indicators collected from surveys.</w:t>
-      </w:r>
-    </w:p>
-    <w:p>
-      <w:pPr>
-        <w:pStyle w:val="BodyText"/>
-      </w:pPr>
-      <w:r>
-        <w:t>Primary Key:</w:t>
-      </w:r>
-    </w:p>
-    <w:p>
-      <w:pPr>
-        <w:pStyle w:val="BodyText"/>
-      </w:pPr>
-      <w:proofErr w:type="spellStart"/>
-      <w:r>
-        <w:t>SatisfactionKey</w:t>
-      </w:r>
-      <w:proofErr w:type="spellEnd"/>
-    </w:p>
-    <w:p>
-      <w:pPr>
-        <w:pStyle w:val="BodyText"/>
-      </w:pPr>
-      <w:r>
-        <w:t>Attributes:</w:t>
-      </w:r>
-    </w:p>
-    <w:p>
-      <w:pPr>
-        <w:pStyle w:val="BodyText"/>
-      </w:pPr>
-      <w:r>
-        <w:t xml:space="preserve">* </w:t>
-      </w:r>
-      <w:proofErr w:type="spellStart"/>
-      <w:r>
-        <w:t>SatisfactionStatus</w:t>
-      </w:r>
-      <w:proofErr w:type="spellEnd"/>
-    </w:p>
-    <w:p>
-      <w:pPr>
-        <w:pStyle w:val="BodyText"/>
-      </w:pPr>
-      <w:r>
-        <w:t xml:space="preserve">* </w:t>
-      </w:r>
-      <w:proofErr w:type="spellStart"/>
-      <w:r>
-        <w:t>WifiRating</w:t>
-      </w:r>
-      <w:proofErr w:type="spellEnd"/>
-    </w:p>
-    <w:p>
-      <w:pPr>
-        <w:pStyle w:val="BodyText"/>
-      </w:pPr>
-      <w:r>
-        <w:t xml:space="preserve">* </w:t>
-      </w:r>
-      <w:proofErr w:type="spellStart"/>
-      <w:r>
-        <w:t>FoodRating</w:t>
-      </w:r>
-      <w:proofErr w:type="spellEnd"/>
-    </w:p>
-    <w:p>
-      <w:pPr>
-        <w:pStyle w:val="BodyText"/>
-      </w:pPr>
-      <w:r>
-        <w:t xml:space="preserve">* </w:t>
-      </w:r>
-      <w:proofErr w:type="spellStart"/>
-      <w:r>
-        <w:t>SeatComfortRating</w:t>
-      </w:r>
-      <w:proofErr w:type="spellEnd"/>
-    </w:p>
-    <w:p>
-      <w:pPr>
-        <w:pStyle w:val="BodyText"/>
-      </w:pPr>
-      <w:r>
-        <w:t xml:space="preserve">* </w:t>
-      </w:r>
-      <w:proofErr w:type="spellStart"/>
-      <w:r>
-        <w:t>EntertainmentRating</w:t>
-      </w:r>
-      <w:proofErr w:type="spellEnd"/>
-    </w:p>
-    <w:p>
-      <w:pPr>
-        <w:pStyle w:val="BodyText"/>
-      </w:pPr>
-      <w:r>
-        <w:t xml:space="preserve">* </w:t>
-      </w:r>
-      <w:proofErr w:type="spellStart"/>
-      <w:r>
-        <w:t>CleanlinessRating</w:t>
-      </w:r>
-      <w:proofErr w:type="spellEnd"/>
-    </w:p>
-    <w:p>
-      <w:pPr>
-        <w:pStyle w:val="BodyText"/>
-      </w:pPr>
-    </w:p>
-    <w:p>
-      <w:pPr>
-        <w:pStyle w:val="BodyText"/>
-      </w:pPr>
-      <w:r>
-        <w:t xml:space="preserve"> Fact Table</w:t>
-      </w:r>
-    </w:p>
-    <w:p>
-      <w:pPr>
-        <w:pStyle w:val="BodyText"/>
-      </w:pPr>
-      <w:proofErr w:type="spellStart"/>
-      <w:r>
-        <w:t>FactSales</w:t>
-      </w:r>
-      <w:proofErr w:type="spellEnd"/>
-    </w:p>
-    <w:p>
-      <w:pPr>
-        <w:pStyle w:val="BodyText"/>
-      </w:pPr>
-      <w:r>
-        <w:t>Purpose:</w:t>
-      </w:r>
-    </w:p>
-    <w:p>
-      <w:pPr>
-        <w:pStyle w:val="BodyText"/>
-      </w:pPr>
-      <w:r>
-        <w:t>Stores quantitative measurements generated by ticket sales transactions.</w:t>
-      </w:r>
-    </w:p>
-    <w:p>
-      <w:pPr>
-        <w:pStyle w:val="BodyText"/>
-      </w:pPr>
-      <w:r>
-        <w:t>Grain:</w:t>
-      </w:r>
-    </w:p>
-    <w:p>
-      <w:pPr>
-        <w:pStyle w:val="BodyText"/>
-      </w:pPr>
-      <w:r>
-        <w:t>One row per ticket booking transaction.</w:t>
-      </w:r>
-    </w:p>
-    <w:p>
-      <w:pPr>
-        <w:pStyle w:val="BodyText"/>
-      </w:pPr>
-      <w:r>
-        <w:t>Primary Key:</w:t>
-      </w:r>
-    </w:p>
-    <w:p>
-      <w:pPr>
-        <w:pStyle w:val="BodyText"/>
-      </w:pPr>
-      <w:proofErr w:type="spellStart"/>
-      <w:r>
-        <w:t>FactSalesKey</w:t>
-      </w:r>
-      <w:proofErr w:type="spellEnd"/>
-    </w:p>
-    <w:p>
-      <w:pPr>
-        <w:pStyle w:val="BodyText"/>
-      </w:pPr>
-      <w:r>
-        <w:t>Foreign Keys:</w:t>
-      </w:r>
-    </w:p>
-    <w:p>
-      <w:pPr>
-        <w:pStyle w:val="BodyText"/>
-      </w:pPr>
-      <w:r>
-        <w:t xml:space="preserve">* </w:t>
-      </w:r>
-      <w:proofErr w:type="spellStart"/>
-      <w:r>
-        <w:t>CustomerKey</w:t>
-      </w:r>
-      <w:proofErr w:type="spellEnd"/>
-    </w:p>
-    <w:p>
-      <w:pPr>
-        <w:pStyle w:val="BodyText"/>
-      </w:pPr>
-      <w:r>
-        <w:t xml:space="preserve">* </w:t>
-      </w:r>
-      <w:proofErr w:type="spellStart"/>
-      <w:r>
-        <w:t>DateKey</w:t>
-      </w:r>
-      <w:proofErr w:type="spellEnd"/>
-    </w:p>
-    <w:p>
-      <w:pPr>
-        <w:pStyle w:val="BodyText"/>
-      </w:pPr>
-      <w:r>
-        <w:t xml:space="preserve">* </w:t>
-      </w:r>
-      <w:proofErr w:type="spellStart"/>
-      <w:r>
-        <w:t>TravelKey</w:t>
-      </w:r>
-      <w:proofErr w:type="spellEnd"/>
-    </w:p>
-    <w:p>
-      <w:pPr>
-        <w:pStyle w:val="BodyText"/>
-      </w:pPr>
-      <w:r>
-        <w:lastRenderedPageBreak/>
-        <w:t xml:space="preserve">* </w:t>
-      </w:r>
-      <w:proofErr w:type="spellStart"/>
-      <w:r>
-        <w:t>BookingKey</w:t>
-      </w:r>
-      <w:proofErr w:type="spellEnd"/>
-    </w:p>
-    <w:p>
-      <w:pPr>
-        <w:pStyle w:val="BodyText"/>
-      </w:pPr>
-      <w:r>
-        <w:t xml:space="preserve">* </w:t>
-      </w:r>
-      <w:proofErr w:type="spellStart"/>
-      <w:r>
-        <w:t>LoyaltyKey</w:t>
-      </w:r>
-      <w:proofErr w:type="spellEnd"/>
-    </w:p>
-    <w:p>
-      <w:pPr>
-        <w:pStyle w:val="BodyText"/>
-      </w:pPr>
-      <w:r>
-        <w:t>Measures:</w:t>
-      </w:r>
-    </w:p>
-    <w:p>
-      <w:pPr>
-        <w:pStyle w:val="BodyText"/>
-      </w:pPr>
-      <w:r>
-        <w:t xml:space="preserve">* </w:t>
-      </w:r>
-      <w:proofErr w:type="spellStart"/>
-      <w:r>
-        <w:t>TicketPrice</w:t>
-      </w:r>
-      <w:proofErr w:type="spellEnd"/>
-    </w:p>
-    <w:p>
-      <w:pPr>
-        <w:pStyle w:val="BodyText"/>
-      </w:pPr>
-      <w:r>
-        <w:t xml:space="preserve">* </w:t>
-      </w:r>
-      <w:proofErr w:type="spellStart"/>
-      <w:r>
-        <w:t>OperatingCost</w:t>
-      </w:r>
-      <w:proofErr w:type="spellEnd"/>
-    </w:p>
-    <w:p>
-      <w:pPr>
-        <w:pStyle w:val="BodyText"/>
-      </w:pPr>
-      <w:r>
-        <w:t xml:space="preserve">* </w:t>
-      </w:r>
-      <w:proofErr w:type="spellStart"/>
-      <w:r>
-        <w:t>AirportFee</w:t>
-      </w:r>
-      <w:proofErr w:type="spellEnd"/>
-    </w:p>
-    <w:p>
-      <w:pPr>
-        <w:pStyle w:val="BodyText"/>
-      </w:pPr>
-      <w:r>
-        <w:t xml:space="preserve">* </w:t>
-      </w:r>
-      <w:proofErr w:type="spellStart"/>
-      <w:r>
-        <w:t>PromotionDiscount</w:t>
-      </w:r>
-      <w:proofErr w:type="spellEnd"/>
-    </w:p>
-    <w:p>
-      <w:pPr>
-        <w:pStyle w:val="BodyText"/>
-      </w:pPr>
-      <w:r>
-        <w:t>* Profit</w:t>
-      </w:r>
-    </w:p>
-    <w:p>
-      <w:pPr>
-        <w:pStyle w:val="BodyText"/>
-      </w:pPr>
-      <w:r>
-        <w:t xml:space="preserve">* </w:t>
-      </w:r>
-      <w:proofErr w:type="spellStart"/>
-      <w:r>
-        <w:t>FlightDistance</w:t>
-      </w:r>
-      <w:proofErr w:type="spellEnd"/>
-    </w:p>
-    <w:p>
-      <w:pPr>
-        <w:pStyle w:val="BodyText"/>
-      </w:pPr>
-      <w:r>
-        <w:t>Fact Table Structure</w:t>
-      </w:r>
-    </w:p>
-    <w:p>
-      <w:pPr>
-        <w:pStyle w:val="BodyText"/>
-      </w:pPr>
-      <w:proofErr w:type="spellStart"/>
-      <w:proofErr w:type="gramStart"/>
-      <w:r>
-        <w:t>FactSales</w:t>
-      </w:r>
-      <w:proofErr w:type="spellEnd"/>
-      <w:r>
-        <w:t>(</w:t>
-      </w:r>
-      <w:proofErr w:type="gramEnd"/>
-    </w:p>
-    <w:p>
-      <w:pPr>
-        <w:pStyle w:val="BodyText"/>
-      </w:pPr>
-      <w:proofErr w:type="spellStart"/>
-      <w:r>
-        <w:t>FactSalesKey</w:t>
-      </w:r>
-      <w:proofErr w:type="spellEnd"/>
-      <w:r>
-        <w:t>,</w:t>
-      </w:r>
-    </w:p>
-    <w:p>
-      <w:pPr>
-        <w:pStyle w:val="BodyText"/>
-      </w:pPr>
-      <w:proofErr w:type="spellStart"/>
-      <w:r>
-        <w:t>CustomerKey</w:t>
-      </w:r>
-      <w:proofErr w:type="spellEnd"/>
-      <w:r>
-        <w:t>,</w:t>
-      </w:r>
-    </w:p>
-    <w:p>
-      <w:pPr>
-        <w:pStyle w:val="BodyText"/>
-      </w:pPr>
-      <w:proofErr w:type="spellStart"/>
-      <w:r>
-        <w:t>DateKey</w:t>
-      </w:r>
-      <w:proofErr w:type="spellEnd"/>
-      <w:r>
-        <w:t>,</w:t>
-      </w:r>
-    </w:p>
-    <w:p>
-      <w:pPr>
-        <w:pStyle w:val="BodyText"/>
-      </w:pPr>
-      <w:proofErr w:type="spellStart"/>
-      <w:r>
-        <w:t>TravelKey</w:t>
-      </w:r>
-      <w:proofErr w:type="spellEnd"/>
-      <w:r>
-        <w:t>,</w:t>
-      </w:r>
-    </w:p>
-    <w:p>
-      <w:pPr>
-        <w:pStyle w:val="BodyText"/>
-      </w:pPr>
-      <w:proofErr w:type="spellStart"/>
-      <w:r>
-        <w:t>BookingKey</w:t>
-      </w:r>
-      <w:proofErr w:type="spellEnd"/>
-      <w:r>
-        <w:t>,</w:t>
-      </w:r>
-    </w:p>
-    <w:p>
-      <w:pPr>
-        <w:pStyle w:val="BodyText"/>
-      </w:pPr>
-      <w:proofErr w:type="spellStart"/>
-      <w:r>
-        <w:t>LoyaltyKey</w:t>
-      </w:r>
-      <w:proofErr w:type="spellEnd"/>
-      <w:r>
-        <w:t>,</w:t>
-      </w:r>
-    </w:p>
-    <w:p>
-      <w:pPr>
-        <w:pStyle w:val="BodyText"/>
-      </w:pPr>
-      <w:proofErr w:type="spellStart"/>
-      <w:r>
-        <w:t>TicketPrice</w:t>
-      </w:r>
-      <w:proofErr w:type="spellEnd"/>
-      <w:r>
-        <w:t>,</w:t>
-      </w:r>
-    </w:p>
-    <w:p>
-      <w:pPr>
-        <w:pStyle w:val="BodyText"/>
-      </w:pPr>
-      <w:proofErr w:type="spellStart"/>
-      <w:r>
-        <w:t>OperatingCost</w:t>
-      </w:r>
-      <w:proofErr w:type="spellEnd"/>
-      <w:r>
-        <w:t>,</w:t>
-      </w:r>
-    </w:p>
-    <w:p>
-      <w:pPr>
-        <w:pStyle w:val="BodyText"/>
-      </w:pPr>
-      <w:proofErr w:type="spellStart"/>
-      <w:r>
-        <w:t>AirportFee</w:t>
-      </w:r>
-      <w:proofErr w:type="spellEnd"/>
-      <w:r>
-        <w:t>,</w:t>
-      </w:r>
-    </w:p>
-    <w:p>
-      <w:pPr>
-        <w:pStyle w:val="BodyText"/>
-      </w:pPr>
-      <w:proofErr w:type="spellStart"/>
-      <w:r>
-        <w:t>PromotionDiscount</w:t>
-      </w:r>
-      <w:proofErr w:type="spellEnd"/>
-      <w:r>
-        <w:t>,</w:t>
-      </w:r>
-    </w:p>
-    <w:p>
-      <w:pPr>
-        <w:pStyle w:val="BodyText"/>
-      </w:pPr>
-      <w:r>
-        <w:t>Profit,</w:t>
-      </w:r>
-    </w:p>
-    <w:p>
-      <w:pPr>
-        <w:pStyle w:val="BodyText"/>
-      </w:pPr>
-      <w:proofErr w:type="spellStart"/>
-      <w:r>
-        <w:t>FlightDistance</w:t>
-      </w:r>
-      <w:proofErr w:type="spellEnd"/>
-    </w:p>
-    <w:p>
-      <w:pPr>
-        <w:pStyle w:val="BodyText"/>
-      </w:pPr>
-      <w:r>
-        <w:t>)</w:t>
-      </w:r>
-    </w:p>
-    <w:p>
-      <w:pPr>
-        <w:pStyle w:val="BodyText"/>
-      </w:pPr>
     </w:p>
     <w:p>
       <w:pPr>
@@ -3627,21 +2263,11 @@
           <w:pPr>
             <w:pStyle w:val="Footer"/>
           </w:pPr>
-          <w:r>
-            <w:fldChar w:fldCharType="begin"/>
-          </w:r>
-          <w:r>
-            <w:instrText xml:space="preserve"> DOCPROPERTY  Classification  \* MERGEFORMAT </w:instrText>
-          </w:r>
-          <w:r>
-            <w:fldChar w:fldCharType="separate"/>
-          </w:r>
-          <w:r>
-            <w:t>CONFIDENTIAL</w:t>
-          </w:r>
-          <w:r>
-            <w:fldChar w:fldCharType="end"/>
-          </w:r>
+          <w:fldSimple w:instr=" DOCPROPERTY  Classification  \* MERGEFORMAT ">
+            <w:r>
+              <w:t>CONFIDENTIAL</w:t>
+            </w:r>
+          </w:fldSimple>
           <w:r>
             <w:tab/>
           </w:r>
@@ -3707,7 +2333,7 @@
             </wp:anchor>
           </w:drawing>
         </mc:Choice>
-        <mc:Fallback xmlns:w16du="http://schemas.microsoft.com/office/word/2023/wordml/word16du" xmlns:oel="http://schemas.microsoft.com/office/2019/extlst">
+        <mc:Fallback xmlns:oel="http://schemas.microsoft.com/office/2019/extlst" xmlns:w16du="http://schemas.microsoft.com/office/word/2023/wordml/word16du">
           <w:pict>
             <v:line w14:anchorId="2927C80C" id="Straight Connector 21" o:spid="_x0000_s1026" style="position:absolute;z-index:251659264;visibility:visible;mso-wrap-style:square;mso-width-percent:0;mso-height-percent:0;mso-wrap-distance-left:9pt;mso-wrap-distance-top:0;mso-wrap-distance-right:9pt;mso-wrap-distance-bottom:0;mso-position-horizontal:absolute;mso-position-horizontal-relative:text;mso-position-vertical:absolute;mso-position-vertical-relative:text;mso-width-percent:0;mso-height-percent:0;mso-width-relative:margin;mso-height-relative:margin" from="-1.55pt,-1.2pt" to="466.55pt,-1.2pt" o:gfxdata="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" strokecolor="#464547" strokeweight="2pt"/>
           </w:pict>
@@ -3778,21 +2404,11 @@
           <w:pPr>
             <w:pStyle w:val="Footer"/>
           </w:pPr>
-          <w:r>
-            <w:fldChar w:fldCharType="begin"/>
-          </w:r>
-          <w:r>
-            <w:instrText xml:space="preserve"> DOCPROPERTY  Classification  \* MERGEFORMAT </w:instrText>
-          </w:r>
-          <w:r>
-            <w:fldChar w:fldCharType="separate"/>
-          </w:r>
-          <w:r>
-            <w:t>CONFIDENTIAL</w:t>
-          </w:r>
-          <w:r>
-            <w:fldChar w:fldCharType="end"/>
-          </w:r>
+          <w:fldSimple w:instr=" DOCPROPERTY  Classification  \* MERGEFORMAT ">
+            <w:r>
+              <w:t>CONFIDENTIAL</w:t>
+            </w:r>
+          </w:fldSimple>
         </w:p>
       </w:tc>
     </w:tr>
@@ -3856,7 +2472,7 @@
             </wp:anchor>
           </w:drawing>
         </mc:Choice>
-        <mc:Fallback xmlns:w16du="http://schemas.microsoft.com/office/word/2023/wordml/word16du" xmlns:oel="http://schemas.microsoft.com/office/2019/extlst">
+        <mc:Fallback xmlns:oel="http://schemas.microsoft.com/office/2019/extlst" xmlns:w16du="http://schemas.microsoft.com/office/word/2023/wordml/word16du">
           <w:pict>
             <v:line w14:anchorId="753841C6" id="Straight Connector 3" o:spid="_x0000_s1026" style="position:absolute;z-index:251660288;visibility:visible;mso-wrap-style:square;mso-width-percent:0;mso-height-percent:0;mso-wrap-distance-left:9pt;mso-wrap-distance-top:0;mso-wrap-distance-right:9pt;mso-wrap-distance-bottom:0;mso-position-horizontal:absolute;mso-position-horizontal-relative:text;mso-position-vertical:absolute;mso-position-vertical-relative:text;mso-width-percent:0;mso-height-percent:0;mso-width-relative:margin;mso-height-relative:margin" from=".2pt,-27.15pt" to="465.9pt,-27.15pt" o:gfxdata="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" strokecolor="#464547" strokeweight="2pt"/>
           </w:pict>
@@ -4115,7 +2731,7 @@
             </wp:anchor>
           </w:drawing>
         </mc:Choice>
-        <mc:Fallback xmlns:w16du="http://schemas.microsoft.com/office/word/2023/wordml/word16du" xmlns:oel="http://schemas.microsoft.com/office/2019/extlst">
+        <mc:Fallback xmlns:oel="http://schemas.microsoft.com/office/2019/extlst" xmlns:w16du="http://schemas.microsoft.com/office/word/2023/wordml/word16du">
           <w:pict>
             <v:line w14:anchorId="6A4D861F" id="Straight Connector 7" o:spid="_x0000_s1026" style="position:absolute;z-index:251661312;visibility:visible;mso-wrap-style:square;mso-width-percent:0;mso-height-percent:0;mso-wrap-distance-left:9pt;mso-wrap-distance-top:0;mso-wrap-distance-right:9pt;mso-wrap-distance-bottom:0;mso-position-horizontal:absolute;mso-position-horizontal-relative:text;mso-position-vertical:absolute;mso-position-vertical-relative:text;mso-width-percent:0;mso-height-percent:0;mso-width-relative:margin;mso-height-relative:page" from=".45pt,1.05pt" to="469.15pt,1.05pt" o:gfxdata="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" strokecolor="#393737 [814]" strokeweight="2pt">
               <v:stroke joinstyle="miter"/>
@@ -7137,29 +5753,6 @@
 </file>
 
 <file path=customXml/item1.xml><?xml version="1.0" encoding="utf-8"?>
-<?mso-contentType ?>
-<FormTemplates xmlns="http://schemas.microsoft.com/sharepoint/v3/contenttype/forms">
-  <Display>DocumentLibraryForm</Display>
-  <Edit>DocumentLibraryForm</Edit>
-  <New>DocumentLibraryForm</New>
-</FormTemplates>
-</file>
-
-<file path=customXml/item2.xml><?xml version="1.0" encoding="utf-8"?>
-<p:properties xmlns:p="http://schemas.microsoft.com/office/2006/metadata/properties" xmlns:xsi="http://www.w3.org/2001/XMLSchema-instance" xmlns:pc="http://schemas.microsoft.com/office/infopath/2007/PartnerControls">
-  <documentManagement>
-    <SharedWithUsers xmlns="7f0dcb33-685e-48d8-b644-2ef2786c1229">
-      <UserInfo>
-        <DisplayName/>
-        <AccountId xsi:nil="true"/>
-        <AccountType/>
-      </UserInfo>
-    </SharedWithUsers>
-  </documentManagement>
-</p:properties>
-</file>
-
-<file path=customXml/item3.xml><?xml version="1.0" encoding="utf-8"?>
 <ct:contentTypeSchema xmlns:ct="http://schemas.microsoft.com/office/2006/metadata/contentType" xmlns:ma="http://schemas.microsoft.com/office/2006/metadata/properties/metaAttributes" ct:_="" ma:_="" ma:contentTypeName="Document" ma:contentTypeID="0x010100B3483E581E535547A5C5133F57803043" ma:contentTypeVersion="7" ma:contentTypeDescription="Create a new document." ma:contentTypeScope="" ma:versionID="26f0e3c34181377a2b428b97b0aacf58">
   <xsd:schema xmlns:xsd="http://www.w3.org/2001/XMLSchema" xmlns:xs="http://www.w3.org/2001/XMLSchema" xmlns:p="http://schemas.microsoft.com/office/2006/metadata/properties" xmlns:ns2="0a074a96-e172-4849-a42b-0522bc04182b" xmlns:ns3="7f0dcb33-685e-48d8-b644-2ef2786c1229" targetNamespace="http://schemas.microsoft.com/office/2006/metadata/properties" ma:root="true" ma:fieldsID="c6eeec6c9df2cadb2fce64bd00511549" ns2:_="" ns3:_="">
     <xsd:import namespace="0a074a96-e172-4849-a42b-0522bc04182b"/>
@@ -7344,25 +5937,30 @@
 </ct:contentTypeSchema>
 </file>
 
-<file path=customXml/itemProps1.xml><?xml version="1.0" encoding="utf-8"?>
-<ds:datastoreItem xmlns:ds="http://schemas.openxmlformats.org/officeDocument/2006/customXml" ds:itemID="{CEAD825D-2413-46BA-BB1F-DCE637B19B0C}">
-  <ds:schemaRefs>
-    <ds:schemaRef ds:uri="http://schemas.microsoft.com/sharepoint/v3/contenttype/forms"/>
-  </ds:schemaRefs>
-</ds:datastoreItem>
+<file path=customXml/item2.xml><?xml version="1.0" encoding="utf-8"?>
+<p:properties xmlns:p="http://schemas.microsoft.com/office/2006/metadata/properties" xmlns:xsi="http://www.w3.org/2001/XMLSchema-instance" xmlns:pc="http://schemas.microsoft.com/office/infopath/2007/PartnerControls">
+  <documentManagement>
+    <SharedWithUsers xmlns="7f0dcb33-685e-48d8-b644-2ef2786c1229">
+      <UserInfo>
+        <DisplayName/>
+        <AccountId xsi:nil="true"/>
+        <AccountType/>
+      </UserInfo>
+    </SharedWithUsers>
+  </documentManagement>
+</p:properties>
 </file>
 
-<file path=customXml/itemProps2.xml><?xml version="1.0" encoding="utf-8"?>
-<ds:datastoreItem xmlns:ds="http://schemas.openxmlformats.org/officeDocument/2006/customXml" ds:itemID="{E4B4D352-B35B-4B3A-95D2-902933709BD2}">
-  <ds:schemaRefs>
-    <ds:schemaRef ds:uri="http://schemas.microsoft.com/office/2006/metadata/properties"/>
-    <ds:schemaRef ds:uri="http://schemas.microsoft.com/office/infopath/2007/PartnerControls"/>
-    <ds:schemaRef ds:uri="7f0dcb33-685e-48d8-b644-2ef2786c1229"/>
-  </ds:schemaRefs>
-</ds:datastoreItem>
+<file path=customXml/item3.xml><?xml version="1.0" encoding="utf-8"?>
+<?mso-contentType ?>
+<FormTemplates xmlns="http://schemas.microsoft.com/sharepoint/v3/contenttype/forms">
+  <Display>DocumentLibraryForm</Display>
+  <Edit>DocumentLibraryForm</Edit>
+  <New>DocumentLibraryForm</New>
+</FormTemplates>
 </file>
 
-<file path=customXml/itemProps3.xml><?xml version="1.0" encoding="utf-8"?>
+<file path=customXml/itemProps1.xml><?xml version="1.0" encoding="utf-8"?>
 <ds:datastoreItem xmlns:ds="http://schemas.openxmlformats.org/officeDocument/2006/customXml" ds:itemID="{2240CE2F-0274-489A-BA80-8887BFB6B269}">
   <ds:schemaRefs>
     <ds:schemaRef ds:uri="http://schemas.microsoft.com/office/2006/metadata/contentType"/>
@@ -7379,4 +5977,22 @@
     <ds:schemaRef ds:uri="http://schemas.microsoft.com/internal/obd"/>
   </ds:schemaRefs>
 </ds:datastoreItem>
+</file>
+
+<file path=customXml/itemProps2.xml><?xml version="1.0" encoding="utf-8"?>
+<ds:datastoreItem xmlns:ds="http://schemas.openxmlformats.org/officeDocument/2006/customXml" ds:itemID="{E4B4D352-B35B-4B3A-95D2-902933709BD2}">
+  <ds:schemaRefs>
+    <ds:schemaRef ds:uri="http://schemas.microsoft.com/office/2006/metadata/properties"/>
+    <ds:schemaRef ds:uri="http://schemas.microsoft.com/office/infopath/2007/PartnerControls"/>
+    <ds:schemaRef ds:uri="7f0dcb33-685e-48d8-b644-2ef2786c1229"/>
+  </ds:schemaRefs>
+</ds:datastoreItem>
+</file>
+
+<file path=customXml/itemProps3.xml><?xml version="1.0" encoding="utf-8"?>
+<ds:datastoreItem xmlns:ds="http://schemas.openxmlformats.org/officeDocument/2006/customXml" ds:itemID="{CEAD825D-2413-46BA-BB1F-DCE637B19B0C}">
+  <ds:schemaRefs>
+    <ds:schemaRef ds:uri="http://schemas.microsoft.com/sharepoint/v3/contenttype/forms"/>
+  </ds:schemaRefs>
+</ds:datastoreItem>
 </file>
</xml_diff>